<commit_message>
repo rename, consolidated v2 mess.
</commit_message>
<xml_diff>
--- a/booklet_template.docx
+++ b/booklet_template.docx
@@ -905,12 +905,14 @@
               <w:text/>
             </w:sdtPr>
             <w:sdtContent>
-              <w:r>
-                <w:rPr>
-                  <w:rStyle w:val="PlaceholderText"/>
-                </w:rPr>
-                <w:t>[Title]</w:t>
-              </w:r>
+              <w:fldSimple w:instr=" DOCPROPERTY Subject " w:dirty="true">
+                <w:r>
+                  <w:rPr>
+                    <w:rStyle w:val="PlaceholderText"/>
+                  </w:rPr>
+                  <w:t>Word Processing Software (D/505/6398)</w:t>
+                </w:r>
+              </w:fldSimple>
             </w:sdtContent>
           </w:sdt>
           <w:r>
@@ -6271,6 +6273,179 @@
       <w:rFonts w:ascii="Verdana" w:hAnsi="Verdana"/>
       <w:sz w:val="36"/>
       <w:szCs w:val="36"/>
+    </w:rPr>
+  </w:style>
+  <w:style w:type="paragraph" w:customStyle="1" w:styleId="Compact">
+    <w:name w:val="Compact"/>
+    <w:basedOn w:val="Normal"/>
+    <w:pPr>
+      <w:keepNext w:val="0"/>
+      <w:keepLines/>
+      <w:spacing w:before="0" w:after="60" w:line="240" w:lineRule="auto"/>
+    </w:pPr>
+    <w:rPr>
+      <w:sz w:val="28"/>
+    </w:rPr>
+  </w:style>
+  <w:style w:type="paragraph" w:customStyle="1" w:styleId="EvidenceSpace">
+    <w:name w:val="EvidenceSpace"/>
+    <w:basedOn w:val="Normal"/>
+    <w:pPr>
+      <w:keepNext w:val="0"/>
+      <w:keepLines/>
+      <w:spacing w:before="0" w:after="0" w:line="400" w:lineRule="exact"/>
+    </w:pPr>
+    <w:rPr>
+      <w:sz w:val="28"/>
+    </w:rPr>
+  </w:style>
+  <w:style w:type="paragraph" w:customStyle="1" w:styleId="EvidenceHint">
+    <w:name w:val="EvidenceHint"/>
+    <w:basedOn w:val="Normal"/>
+    <w:pPr>
+      <w:keepNext/>
+      <w:keepLines/>
+      <w:spacing w:before="0" w:after="80"/>
+    </w:pPr>
+    <w:rPr>
+      <w:i/>
+      <w:color w:val="475569"/>
+      <w:sz w:val="28"/>
+    </w:rPr>
+  </w:style>
+  <w:style w:type="table" w:customStyle="1" w:styleId="CoverFrame">
+    <w:name w:val="CoverFrame"/>
+    <w:basedOn w:val="TableNormal"/>
+    <w:tblPr>
+      <w:tblBorders>
+        <w:top w:val="single" w:sz="4" w:color="000000"/>
+        <w:left w:val="single" w:sz="4" w:color="000000"/>
+        <w:bottom w:val="single" w:sz="4" w:color="000000"/>
+        <w:right w:val="single" w:sz="4" w:color="000000"/>
+        <w:insideH w:val="nil" w:sz="4" w:color="000000"/>
+        <w:insideV w:val="nil" w:sz="4" w:color="000000"/>
+      </w:tblBorders>
+      <w:tblCellMar>
+        <w:top w:w="140" w:type="dxa"/>
+        <w:left w:w="140" w:type="dxa"/>
+        <w:bottom w:w="140" w:type="dxa"/>
+        <w:right w:w="140" w:type="dxa"/>
+      </w:tblCellMar>
+    </w:tblPr>
+  </w:style>
+  <w:style w:type="table" w:customStyle="1" w:styleId="CoverDates">
+    <w:name w:val="CoverDates"/>
+    <w:basedOn w:val="TableNormal"/>
+    <w:tblPr>
+      <w:tblBorders>
+        <w:top w:val="single" w:sz="4" w:color="000000"/>
+        <w:left w:val="single" w:sz="4" w:color="000000"/>
+        <w:bottom w:val="single" w:sz="4" w:color="000000"/>
+        <w:right w:val="single" w:sz="4" w:color="000000"/>
+        <w:insideH w:val="single" w:sz="4" w:color="000000"/>
+        <w:insideV w:val="single" w:sz="4" w:color="000000"/>
+      </w:tblBorders>
+      <w:tblCellMar>
+        <w:top w:w="100" w:type="dxa"/>
+        <w:left w:w="100" w:type="dxa"/>
+        <w:bottom w:w="100" w:type="dxa"/>
+        <w:right w:w="100" w:type="dxa"/>
+      </w:tblCellMar>
+    </w:tblPr>
+    <w:tblStylePr w:type="firstRow">
+      <w:rPr>
+        <w:b/>
+      </w:rPr>
+    </w:tblStylePr>
+  </w:style>
+  <w:style w:type="paragraph" w:customStyle="1" w:styleId="CoverName">
+    <w:name w:val="CoverName"/>
+    <w:basedOn w:val="Normal"/>
+    <w:pPr>
+      <w:keepNext/>
+      <w:keepLines/>
+      <w:spacing w:before="360" w:after="360" w:line="240" w:lineRule="auto"/>
+      <w:jc w:val="left"/>
+    </w:pPr>
+    <w:rPr>
+      <w:rFonts w:ascii="Arial" w:hAnsi="Arial"/>
+      <w:b w:val="0"/>
+      <w:sz w:val="44"/>
+    </w:rPr>
+  </w:style>
+  <w:style w:type="paragraph" w:customStyle="1" w:styleId="CoverQualification">
+    <w:name w:val="CoverQualification"/>
+    <w:basedOn w:val="Normal"/>
+    <w:pPr>
+      <w:keepNext/>
+      <w:keepLines/>
+      <w:spacing w:before="0" w:after="0" w:line="240" w:lineRule="auto"/>
+      <w:jc w:val="center"/>
+    </w:pPr>
+    <w:rPr>
+      <w:rFonts w:ascii="Arial" w:hAnsi="Arial"/>
+      <w:b w:val="0"/>
+      <w:sz w:val="48"/>
+    </w:rPr>
+  </w:style>
+  <w:style w:type="paragraph" w:customStyle="1" w:styleId="CoverCode">
+    <w:name w:val="CoverCode"/>
+    <w:basedOn w:val="Normal"/>
+    <w:pPr>
+      <w:keepNext/>
+      <w:keepLines/>
+      <w:spacing w:before="0" w:after="480" w:line="240" w:lineRule="auto"/>
+      <w:jc w:val="center"/>
+    </w:pPr>
+    <w:rPr>
+      <w:rFonts w:ascii="Arial" w:hAnsi="Arial"/>
+      <w:b/>
+      <w:sz w:val="48"/>
+    </w:rPr>
+  </w:style>
+  <w:style w:type="paragraph" w:customStyle="1" w:styleId="CoverUnitTitle">
+    <w:name w:val="CoverUnitTitle"/>
+    <w:basedOn w:val="Normal"/>
+    <w:pPr>
+      <w:keepNext/>
+      <w:keepLines/>
+      <w:spacing w:before="0" w:after="360" w:line="240" w:lineRule="auto"/>
+      <w:jc w:val="center"/>
+    </w:pPr>
+    <w:rPr>
+      <w:rFonts w:ascii="Arial" w:hAnsi="Arial"/>
+      <w:b/>
+      <w:sz w:val="48"/>
+    </w:rPr>
+  </w:style>
+  <w:style w:type="paragraph" w:customStyle="1" w:styleId="CoverArtwork">
+    <w:name w:val="CoverArtwork"/>
+    <w:basedOn w:val="Normal"/>
+    <w:pPr>
+      <w:keepNext w:val="0"/>
+      <w:keepLines/>
+      <w:spacing w:before="120" w:after="240" w:line="240" w:lineRule="auto"/>
+      <w:jc w:val="center"/>
+    </w:pPr>
+    <w:rPr>
+      <w:rFonts w:ascii="Arial" w:hAnsi="Arial"/>
+      <w:b w:val="0"/>
+      <w:sz w:val="28"/>
+    </w:rPr>
+  </w:style>
+  <w:style w:type="paragraph" w:customStyle="1" w:styleId="AssessmentCriteria">
+    <w:name w:val="Assessment Criteria"/>
+    <w:basedOn w:val="Normal"/>
+    <w:next w:val="Normal"/>
+    <w:qFormat/>
+    <w:pPr>
+      <w:keepNext w:val="0"/>
+      <w:keepLines/>
+      <w:spacing w:before="0" w:after="40" w:line="240" w:lineRule="auto"/>
+    </w:pPr>
+    <w:rPr>
+      <w:sz w:val="24"/>
+      <w:szCs w:val="24"/>
     </w:rPr>
   </w:style>
 </w:styles>

</xml_diff>